<commit_message>
Minor Project Topic Document Tweaks
</commit_message>
<xml_diff>
--- a/Project/Documentation/Project_Topic_Document_Loo_Bridget.docx
+++ b/Project/Documentation/Project_Topic_Document_Loo_Bridget.docx
@@ -1,6 +1,6 @@
 
 <file path=word/document.xml><?xml version="1.0" encoding="utf-8"?>
-<w:document xmlns:wpc="http://schemas.microsoft.com/office/word/2010/wordprocessingCanvas" xmlns:cx="http://schemas.microsoft.com/office/drawing/2014/chartex" xmlns:cx1="http://schemas.microsoft.com/office/drawing/2015/9/8/chartex" xmlns:cx2="http://schemas.microsoft.com/office/drawing/2015/10/21/chartex" xmlns:cx3="http://schemas.microsoft.com/office/drawing/2016/5/9/chartex" xmlns:cx4="http://schemas.microsoft.com/office/drawing/2016/5/10/chartex" xmlns:cx5="http://schemas.microsoft.com/office/drawing/2016/5/11/chartex" xmlns:cx6="http://schemas.microsoft.com/office/drawing/2016/5/12/chartex" xmlns:cx7="http://schemas.microsoft.com/office/drawing/2016/5/13/chartex" xmlns:cx8="http://schemas.microsoft.com/office/drawing/2016/5/14/chartex" xmlns:mc="http://schemas.openxmlformats.org/markup-compatibility/2006" xmlns:aink="http://schemas.microsoft.com/office/drawing/2016/ink" xmlns:am3d="http://schemas.microsoft.com/office/drawing/2017/model3d" xmlns:o="urn:schemas-microsoft-com:office:office" xmlns:oel="http://schemas.microsoft.com/office/2019/extlst" xmlns:r="http://schemas.openxmlformats.org/officeDocument/2006/relationships" xmlns:m="http://schemas.openxmlformats.org/officeDocument/2006/math" xmlns:v="urn:schemas-microsoft-com:vml" xmlns:wp14="http://schemas.microsoft.com/office/word/2010/wordprocessingDrawing" xmlns:wp="http://schemas.openxmlformats.org/drawingml/2006/wordprocessingDrawing" xmlns:w10="urn:schemas-microsoft-com:office:word" xmlns:w="http://schemas.openxmlformats.org/wordprocessingml/2006/main" xmlns:w14="http://schemas.microsoft.com/office/word/2010/wordml" xmlns:w15="http://schemas.microsoft.com/office/word/2012/wordml" xmlns:w16cei="http://schemas.microsoft.com/office/word/2026/wordml/cei" xmlns:w16cex="http://schemas.microsoft.com/office/word/2018/wordml/cex" xmlns:w16cid="http://schemas.microsoft.com/office/word/2016/wordml/cid" xmlns:w16="http://schemas.microsoft.com/office/word/2018/wordml" xmlns:w16du="http://schemas.microsoft.com/office/word/2023/wordml/word16du" xmlns:w16sdtdh="http://schemas.microsoft.com/office/word/2020/wordml/sdtdatahash" xmlns:w16sdtfl="http://schemas.microsoft.com/office/word/2024/wordml/sdtformatlock" xmlns:w16se="http://schemas.microsoft.com/office/word/2015/wordml/symex" xmlns:wpg="http://schemas.microsoft.com/office/word/2010/wordprocessingGroup" xmlns:wpi="http://schemas.microsoft.com/office/word/2010/wordprocessingInk" xmlns:wne="http://schemas.microsoft.com/office/word/2006/wordml" xmlns:wps="http://schemas.microsoft.com/office/word/2010/wordprocessingShape" mc:Ignorable="w14 w15 w16se w16cid w16 w16cex w16sdtdh w16sdtfl w16du wp14">
+<w:document xmlns:wpc="http://schemas.microsoft.com/office/word/2010/wordprocessingCanvas" xmlns:cx="http://schemas.microsoft.com/office/drawing/2014/chartex" xmlns:cx1="http://schemas.microsoft.com/office/drawing/2015/9/8/chartex" xmlns:cx2="http://schemas.microsoft.com/office/drawing/2015/10/21/chartex" xmlns:cx3="http://schemas.microsoft.com/office/drawing/2016/5/9/chartex" xmlns:cx4="http://schemas.microsoft.com/office/drawing/2016/5/10/chartex" xmlns:cx5="http://schemas.microsoft.com/office/drawing/2016/5/11/chartex" xmlns:cx6="http://schemas.microsoft.com/office/drawing/2016/5/12/chartex" xmlns:cx7="http://schemas.microsoft.com/office/drawing/2016/5/13/chartex" xmlns:cx8="http://schemas.microsoft.com/office/drawing/2016/5/14/chartex" xmlns:mc="http://schemas.openxmlformats.org/markup-compatibility/2006" xmlns:aink="http://schemas.microsoft.com/office/drawing/2016/ink" xmlns:am3d="http://schemas.microsoft.com/office/drawing/2017/model3d" xmlns:o="urn:schemas-microsoft-com:office:office" xmlns:oel="http://schemas.microsoft.com/office/2019/extlst" xmlns:r="http://schemas.openxmlformats.org/officeDocument/2006/relationships" xmlns:m="http://schemas.openxmlformats.org/officeDocument/2006/math" xmlns:v="urn:schemas-microsoft-com:vml" xmlns:wp14="http://schemas.microsoft.com/office/word/2010/wordprocessingDrawing" xmlns:wp="http://schemas.openxmlformats.org/drawingml/2006/wordprocessingDrawing" xmlns:w10="urn:schemas-microsoft-com:office:word" xmlns:w="http://schemas.openxmlformats.org/wordprocessingml/2006/main" xmlns:w14="http://schemas.microsoft.com/office/word/2010/wordml" xmlns:w15="http://schemas.microsoft.com/office/word/2012/wordml" xmlns:w16cex="http://schemas.microsoft.com/office/word/2018/wordml/cex" xmlns:w16cid="http://schemas.microsoft.com/office/word/2016/wordml/cid" xmlns:w16="http://schemas.microsoft.com/office/word/2018/wordml" xmlns:w16du="http://schemas.microsoft.com/office/word/2023/wordml/word16du" xmlns:w16sdtdh="http://schemas.microsoft.com/office/word/2020/wordml/sdtdatahash" xmlns:w16sdtfl="http://schemas.microsoft.com/office/word/2024/wordml/sdtformatlock" xmlns:w16se="http://schemas.microsoft.com/office/word/2015/wordml/symex" xmlns:wpg="http://schemas.microsoft.com/office/word/2010/wordprocessingGroup" xmlns:wpi="http://schemas.microsoft.com/office/word/2010/wordprocessingInk" xmlns:wne="http://schemas.microsoft.com/office/word/2006/wordml" xmlns:wps="http://schemas.microsoft.com/office/word/2010/wordprocessingShape" mc:Ignorable="w14 w15 w16se w16cid w16 w16cex w16sdtdh w16sdtfl w16du wp14">
   <w:body>
     <w:p>
       <w:pPr>
@@ -114,18 +114,19 @@
     </w:p>
     <w:tbl>
       <w:tblPr>
-        <w:tblStyle w:val="TableGrid"/>
+        <w:tblStyle w:val="GridTable1Light"/>
         <w:tblW w:w="0" w:type="auto"/>
-        <w:tblLook w:val="04A0" w:firstRow="1" w:lastRow="0" w:firstColumn="1" w:lastColumn="0" w:noHBand="0" w:noVBand="1"/>
+        <w:tblLook w:val="0480" w:firstRow="0" w:lastRow="0" w:firstColumn="1" w:lastColumn="0" w:noHBand="0" w:noVBand="1"/>
       </w:tblPr>
       <w:tblGrid>
-        <w:gridCol w:w="2785"/>
-        <w:gridCol w:w="6565"/>
+        <w:gridCol w:w="2310"/>
+        <w:gridCol w:w="950"/>
       </w:tblGrid>
       <w:tr>
         <w:tc>
           <w:tcPr>
-            <w:tcW w:w="2785" w:type="dxa"/>
+            <w:cnfStyle w:val="001000000000" w:firstRow="0" w:lastRow="0" w:firstColumn="1" w:lastColumn="0" w:oddVBand="0" w:evenVBand="0" w:oddHBand="0" w:evenHBand="0" w:firstRowFirstColumn="0" w:firstRowLastColumn="0" w:lastRowFirstColumn="0" w:lastRowLastColumn="0"/>
+            <w:tcW w:w="0" w:type="auto"/>
           </w:tcPr>
           <w:p>
             <w:r>
@@ -135,9 +136,12 @@
         </w:tc>
         <w:tc>
           <w:tcPr>
-            <w:tcW w:w="6565" w:type="dxa"/>
-          </w:tcPr>
-          <w:p>
+            <w:tcW w:w="0" w:type="auto"/>
+          </w:tcPr>
+          <w:p>
+            <w:pPr>
+              <w:cnfStyle w:val="000000000000" w:firstRow="0" w:lastRow="0" w:firstColumn="0" w:lastColumn="0" w:oddVBand="0" w:evenVBand="0" w:oddHBand="0" w:evenHBand="0" w:firstRowFirstColumn="0" w:firstRowLastColumn="0" w:lastRowFirstColumn="0" w:lastRowLastColumn="0"/>
+            </w:pPr>
             <w:r>
               <w:t>Richard</w:t>
             </w:r>
@@ -147,7 +151,8 @@
       <w:tr>
         <w:tc>
           <w:tcPr>
-            <w:tcW w:w="2785" w:type="dxa"/>
+            <w:cnfStyle w:val="001000000000" w:firstRow="0" w:lastRow="0" w:firstColumn="1" w:lastColumn="0" w:oddVBand="0" w:evenVBand="0" w:oddHBand="0" w:evenHBand="0" w:firstRowFirstColumn="0" w:firstRowLastColumn="0" w:lastRowFirstColumn="0" w:lastRowLastColumn="0"/>
+            <w:tcW w:w="0" w:type="auto"/>
           </w:tcPr>
           <w:p>
             <w:r>
@@ -157,9 +162,12 @@
         </w:tc>
         <w:tc>
           <w:tcPr>
-            <w:tcW w:w="6565" w:type="dxa"/>
-          </w:tcPr>
-          <w:p>
+            <w:tcW w:w="0" w:type="auto"/>
+          </w:tcPr>
+          <w:p>
+            <w:pPr>
+              <w:cnfStyle w:val="000000000000" w:firstRow="0" w:lastRow="0" w:firstColumn="0" w:lastColumn="0" w:oddVBand="0" w:evenVBand="0" w:oddHBand="0" w:evenHBand="0" w:firstRowFirstColumn="0" w:firstRowLastColumn="0" w:lastRowFirstColumn="0" w:lastRowLastColumn="0"/>
+            </w:pPr>
             <w:r>
               <w:t>Bridget</w:t>
             </w:r>
@@ -169,7 +177,8 @@
       <w:tr>
         <w:tc>
           <w:tcPr>
-            <w:tcW w:w="2785" w:type="dxa"/>
+            <w:cnfStyle w:val="001000000000" w:firstRow="0" w:lastRow="0" w:firstColumn="1" w:lastColumn="0" w:oddVBand="0" w:evenVBand="0" w:oddHBand="0" w:evenHBand="0" w:firstRowFirstColumn="0" w:firstRowLastColumn="0" w:lastRowFirstColumn="0" w:lastRowLastColumn="0"/>
+            <w:tcW w:w="0" w:type="auto"/>
           </w:tcPr>
           <w:p>
             <w:r>
@@ -179,9 +188,12 @@
         </w:tc>
         <w:tc>
           <w:tcPr>
-            <w:tcW w:w="6565" w:type="dxa"/>
-          </w:tcPr>
-          <w:p>
+            <w:tcW w:w="0" w:type="auto"/>
+          </w:tcPr>
+          <w:p>
+            <w:pPr>
+              <w:cnfStyle w:val="000000000000" w:firstRow="0" w:lastRow="0" w:firstColumn="0" w:lastColumn="0" w:oddVBand="0" w:evenVBand="0" w:oddHBand="0" w:evenHBand="0" w:firstRowFirstColumn="0" w:firstRowLastColumn="0" w:lastRowFirstColumn="0" w:lastRowLastColumn="0"/>
+            </w:pPr>
             <w:r>
               <w:t>Shab</w:t>
             </w:r>
@@ -189,7 +201,6 @@
         </w:tc>
       </w:tr>
     </w:tbl>
-    <w:p/>
     <w:p>
       <w:pPr>
         <w:pStyle w:val="Heading1"/>
@@ -218,17 +229,17 @@
           <w:tcPr>
             <w:tcW w:w="4945" w:type="dxa"/>
           </w:tcPr>
-          <w:p/>
-          <w:p>
+          <w:p>
+            <w:pPr>
+              <w:spacing w:before="120" w:after="120"/>
+            </w:pPr>
             <w:r>
               <w:t>Softball League Manager</w:t>
             </w:r>
           </w:p>
-          <w:p/>
         </w:tc>
       </w:tr>
     </w:tbl>
-    <w:p/>
     <w:p>
       <w:pPr>
         <w:pStyle w:val="Heading1"/>
@@ -257,13 +268,14 @@
           <w:tcPr>
             <w:tcW w:w="4945" w:type="dxa"/>
           </w:tcPr>
-          <w:p/>
-          <w:p>
+          <w:p>
+            <w:pPr>
+              <w:spacing w:before="120" w:after="120"/>
+            </w:pPr>
             <w:r>
               <w:t>Sky Blue</w:t>
             </w:r>
           </w:p>
-          <w:p/>
         </w:tc>
       </w:tr>
     </w:tbl>
@@ -273,7 +285,6 @@
         <w:pStyle w:val="Heading1"/>
       </w:pPr>
       <w:r>
-        <w:lastRenderedPageBreak/>
         <w:t>Description (300 words)</w:t>
       </w:r>
     </w:p>
@@ -293,86 +304,18 @@
           </w:tcPr>
           <w:p>
             <w:pPr>
-              <w:spacing w:before="240"/>
+              <w:spacing w:before="120" w:after="120"/>
             </w:pPr>
             <w:r>
               <w:t xml:space="preserve">Create an application that can be used to manage a softball league. </w:t>
             </w:r>
           </w:p>
           <w:p>
-            <w:r>
-              <w:t>This application will need to track the following statistics:</w:t>
-            </w:r>
-          </w:p>
-          <w:p/>
-          <w:p>
-            <w:r>
-              <w:t>Team Names</w:t>
-            </w:r>
-          </w:p>
-          <w:p>
-            <w:r>
-              <w:t>Wins</w:t>
-            </w:r>
-          </w:p>
-          <w:p>
-            <w:r>
-              <w:t>Losses</w:t>
-            </w:r>
-          </w:p>
-          <w:p>
-            <w:r>
-              <w:t>Plus/Minus</w:t>
-            </w:r>
-          </w:p>
-          <w:p>
-            <w:r>
-              <w:t>Mercy Wins.</w:t>
-            </w:r>
-          </w:p>
-          <w:p>
-            <w:r>
-              <w:t>Win Percentage.</w:t>
-            </w:r>
-          </w:p>
-          <w:p>
-            <w:r>
-              <w:t>Games played</w:t>
-            </w:r>
-          </w:p>
-          <w:p>
-            <w:r>
-              <w:t>Standings</w:t>
-            </w:r>
-          </w:p>
-          <w:p/>
-          <w:p>
-            <w:r>
-              <w:t xml:space="preserve">Games are 7 innings in </w:t>
-            </w:r>
-            <w:proofErr w:type="gramStart"/>
-            <w:r>
-              <w:t>length,</w:t>
-            </w:r>
-            <w:proofErr w:type="gramEnd"/>
-            <w:r>
-              <w:t xml:space="preserve"> however </w:t>
-            </w:r>
-            <w:proofErr w:type="gramStart"/>
-            <w:r>
-              <w:t>a game</w:t>
-            </w:r>
-            <w:proofErr w:type="gramEnd"/>
-            <w:r>
-              <w:t xml:space="preserve"> ends if </w:t>
-            </w:r>
-            <w:proofErr w:type="gramStart"/>
-            <w:r>
-              <w:t>a team</w:t>
-            </w:r>
-            <w:proofErr w:type="gramEnd"/>
-            <w:r>
-              <w:t xml:space="preserve"> is up by 10 runs after the 5</w:t>
+            <w:pPr>
+              <w:spacing w:before="120" w:after="120"/>
+            </w:pPr>
+            <w:r>
+              <w:t>Games are 7 innings in length; however, a game ends if a team is up by 10 runs after the 5</w:t>
             </w:r>
             <w:r>
               <w:rPr>
@@ -384,42 +327,140 @@
               <w:t xml:space="preserve"> inning.</w:t>
             </w:r>
           </w:p>
-          <w:p/>
-          <w:p>
+          <w:p>
+            <w:pPr>
+              <w:spacing w:before="120" w:after="120"/>
+            </w:pPr>
+            <w:r>
+              <w:t>The application tracks the following information about each game:</w:t>
+            </w:r>
+          </w:p>
+          <w:p>
+            <w:pPr>
+              <w:spacing w:before="120" w:after="120"/>
+            </w:pPr>
+            <w:r>
+              <w:t>Team Names</w:t>
+            </w:r>
+            <w:r>
+              <w:br/>
+              <w:t>Team Scores</w:t>
+            </w:r>
+            <w:r>
+              <w:br/>
+              <w:t>Mercy Wins</w:t>
+            </w:r>
+          </w:p>
+          <w:p>
+            <w:pPr>
+              <w:spacing w:before="120" w:after="120"/>
+            </w:pPr>
             <w:r>
               <w:t xml:space="preserve">Prompt the user to enter the two teams that are playing and input the score. Use logic to determine the team with the higher score gets a win, and the loser takes an L. </w:t>
             </w:r>
           </w:p>
-          <w:p/>
-          <w:p>
-            <w:r>
-              <w:t>Wins and losses will be tracked, so they can be tracked and displayed to the user after they’re entered.</w:t>
-            </w:r>
-          </w:p>
-          <w:p/>
-          <w:p>
-            <w:r>
-              <w:t xml:space="preserve">Prompt the user to ask if the game was a mercy rule win. </w:t>
-            </w:r>
-          </w:p>
-          <w:p/>
-          <w:p>
-            <w:r>
-              <w:t>Display the teams plus/minus – This is the difference in score in a game. (Example – Team A beats Team B by a score of 10-7, Team A has a plus/minus of +3, while Team B gets a -3)</w:t>
-            </w:r>
-          </w:p>
-          <w:p/>
-          <w:p>
-            <w:r>
-              <w:t xml:space="preserve">Then sort the teams by </w:t>
-            </w:r>
-            <w:proofErr w:type="gramStart"/>
-            <w:r>
-              <w:t>amount</w:t>
-            </w:r>
-            <w:proofErr w:type="gramEnd"/>
+          <w:p>
+            <w:pPr>
+              <w:spacing w:before="120" w:after="120"/>
+            </w:pPr>
+            <w:r>
+              <w:t>Prompt the user to ask if the game was a mercy rule win.</w:t>
+            </w:r>
+            <w:r>
+              <w:rPr>
+                <w:highlight w:val="yellow"/>
+              </w:rPr>
+              <w:t xml:space="preserve"> </w:t>
+            </w:r>
+          </w:p>
+          <w:p>
+            <w:pPr>
+              <w:spacing w:before="120" w:after="120"/>
+            </w:pPr>
+            <w:r>
+              <w:t>T</w:t>
+            </w:r>
+            <w:r>
+              <w:t>eam standings will be calculated using the records of these games and then displayed to the user</w:t>
+            </w:r>
+            <w:r>
+              <w:t xml:space="preserve"> with the following information:</w:t>
+            </w:r>
+          </w:p>
+          <w:p>
+            <w:pPr>
+              <w:spacing w:before="120" w:after="120"/>
+            </w:pPr>
+            <w:r>
+              <w:t>Team Name</w:t>
+            </w:r>
+            <w:r>
+              <w:br/>
+              <w:t>Number of Wins</w:t>
+            </w:r>
+            <w:r>
+              <w:br/>
+              <w:t>Number of Losses</w:t>
+            </w:r>
+            <w:r>
+              <w:br/>
+              <w:t>Number of Games Played</w:t>
+            </w:r>
+            <w:r>
+              <w:br/>
+              <w:t>Number of Mercy Wins</w:t>
+            </w:r>
+            <w:r>
+              <w:br/>
+              <w:t>Win Percentage</w:t>
+            </w:r>
+          </w:p>
+          <w:p>
+            <w:pPr>
+              <w:spacing w:before="120" w:after="120"/>
+            </w:pPr>
+            <w:r>
+              <w:t xml:space="preserve">When displaying teams, sort them </w:t>
+            </w:r>
+            <w:r>
+              <w:t xml:space="preserve">by </w:t>
+            </w:r>
+            <w:r>
+              <w:t>number</w:t>
+            </w:r>
             <w:r>
               <w:t xml:space="preserve"> of wins.</w:t>
+            </w:r>
+          </w:p>
+          <w:p>
+            <w:pPr>
+              <w:spacing w:before="120" w:after="120"/>
+            </w:pPr>
+            <w:r>
+              <w:t>The history of games can also be displayed to the user with the following information:</w:t>
+            </w:r>
+          </w:p>
+          <w:p>
+            <w:pPr>
+              <w:spacing w:before="120" w:after="120"/>
+            </w:pPr>
+            <w:r>
+              <w:t>Team Names</w:t>
+            </w:r>
+            <w:r>
+              <w:br/>
+              <w:t>Team Scores</w:t>
+            </w:r>
+            <w:r>
+              <w:br/>
+              <w:t>Was it a Mercy Win?</w:t>
+            </w:r>
+            <w:r>
+              <w:br/>
+              <w:t xml:space="preserve">Score Differential (Plus/Minus) </w:t>
+            </w:r>
+            <w:r>
+              <w:t>(Example – Team A beats Team B by a score of 10-7, Team A has a plus/minus of +3, while Team B gets a -3)</w:t>
             </w:r>
           </w:p>
         </w:tc>
@@ -486,7 +527,7 @@
           </w:tcPr>
           <w:p>
             <w:r>
-              <w:t>Team Name</w:t>
+              <w:t>Game ID</w:t>
             </w:r>
           </w:p>
         </w:tc>
@@ -496,7 +537,7 @@
           </w:tcPr>
           <w:p>
             <w:r>
-              <w:t>String</w:t>
+              <w:t>Int</w:t>
             </w:r>
           </w:p>
         </w:tc>
@@ -506,7 +547,7 @@
           </w:tcPr>
           <w:p>
             <w:r>
-              <w:t>Name of Team</w:t>
+              <w:t>The unique identifier for a game</w:t>
             </w:r>
           </w:p>
         </w:tc>
@@ -518,7 +559,13 @@
           </w:tcPr>
           <w:p>
             <w:r>
-              <w:t>Wins</w:t>
+              <w:t xml:space="preserve">Team </w:t>
+            </w:r>
+            <w:r>
+              <w:t xml:space="preserve">1 </w:t>
+            </w:r>
+            <w:r>
+              <w:t>Name</w:t>
             </w:r>
           </w:p>
         </w:tc>
@@ -528,7 +575,7 @@
           </w:tcPr>
           <w:p>
             <w:r>
-              <w:t>Int</w:t>
+              <w:t>String</w:t>
             </w:r>
           </w:p>
         </w:tc>
@@ -538,7 +585,10 @@
           </w:tcPr>
           <w:p>
             <w:r>
-              <w:t>How many wins a team has</w:t>
+              <w:t>Name of Team</w:t>
+            </w:r>
+            <w:r>
+              <w:t xml:space="preserve"> 1</w:t>
             </w:r>
           </w:p>
         </w:tc>
@@ -550,7 +600,7 @@
           </w:tcPr>
           <w:p>
             <w:r>
-              <w:t>Losses</w:t>
+              <w:t>Team 2 Name</w:t>
             </w:r>
           </w:p>
         </w:tc>
@@ -560,7 +610,7 @@
           </w:tcPr>
           <w:p>
             <w:r>
-              <w:t>Int</w:t>
+              <w:t>String</w:t>
             </w:r>
           </w:p>
         </w:tc>
@@ -570,7 +620,7 @@
           </w:tcPr>
           <w:p>
             <w:r>
-              <w:t>How many losses a team has</w:t>
+              <w:t>Name of Team 2</w:t>
             </w:r>
           </w:p>
         </w:tc>
@@ -582,8 +632,13 @@
           </w:tcPr>
           <w:p>
             <w:r>
-              <w:t>Plus/Minus</w:t>
-            </w:r>
+              <w:t xml:space="preserve">Team 1 </w:t>
+            </w:r>
+            <w:proofErr w:type="gramStart"/>
+            <w:r>
+              <w:t>Score</w:t>
+            </w:r>
+            <w:proofErr w:type="gramEnd"/>
           </w:p>
         </w:tc>
         <w:tc>
@@ -602,7 +657,7 @@
           </w:tcPr>
           <w:p>
             <w:r>
-              <w:t>Score differential</w:t>
+              <w:t>Team 1’s score</w:t>
             </w:r>
           </w:p>
         </w:tc>
@@ -614,8 +669,13 @@
           </w:tcPr>
           <w:p>
             <w:r>
-              <w:t>Mercy Wins</w:t>
-            </w:r>
+              <w:t xml:space="preserve">Team 2 </w:t>
+            </w:r>
+            <w:proofErr w:type="gramStart"/>
+            <w:r>
+              <w:t>Score</w:t>
+            </w:r>
+            <w:proofErr w:type="gramEnd"/>
           </w:p>
         </w:tc>
         <w:tc>
@@ -624,7 +684,7 @@
           </w:tcPr>
           <w:p>
             <w:r>
-              <w:t>Int</w:t>
+              <w:t xml:space="preserve">Int </w:t>
             </w:r>
           </w:p>
         </w:tc>
@@ -634,16 +694,7 @@
           </w:tcPr>
           <w:p>
             <w:r>
-              <w:t>Tracking mercy rule (Up by 10 runs after 5</w:t>
-            </w:r>
-            <w:r>
-              <w:rPr>
-                <w:vertAlign w:val="superscript"/>
-              </w:rPr>
-              <w:t>th</w:t>
-            </w:r>
-            <w:r>
-              <w:t xml:space="preserve"> inning)</w:t>
+              <w:t>Team 2’s score</w:t>
             </w:r>
           </w:p>
         </w:tc>
@@ -655,7 +706,7 @@
           </w:tcPr>
           <w:p>
             <w:r>
-              <w:t>Win Percentage</w:t>
+              <w:t>Is Mercy Win</w:t>
             </w:r>
           </w:p>
         </w:tc>
@@ -665,7 +716,7 @@
           </w:tcPr>
           <w:p>
             <w:r>
-              <w:t>Double</w:t>
+              <w:t>Boolean</w:t>
             </w:r>
           </w:p>
         </w:tc>
@@ -675,10 +726,7 @@
           </w:tcPr>
           <w:p>
             <w:r>
-              <w:t>Percentage of games won.</w:t>
-            </w:r>
-            <w:r>
-              <w:t xml:space="preserve"> </w:t>
+              <w:t>Whether or not the winning team won by mercy rule</w:t>
             </w:r>
           </w:p>
         </w:tc>
@@ -690,7 +738,7 @@
           </w:tcPr>
           <w:p>
             <w:r>
-              <w:t>Games played</w:t>
+              <w:t>Score Differential</w:t>
             </w:r>
           </w:p>
         </w:tc>
@@ -710,42 +758,7 @@
           </w:tcPr>
           <w:p>
             <w:r>
-              <w:t>How many games a team has played</w:t>
-            </w:r>
-          </w:p>
-        </w:tc>
-      </w:tr>
-      <w:tr>
-        <w:tc>
-          <w:tcPr>
-            <w:tcW w:w="1705" w:type="dxa"/>
-          </w:tcPr>
-          <w:p>
-            <w:r>
-              <w:t>Standings</w:t>
-            </w:r>
-          </w:p>
-        </w:tc>
-        <w:tc>
-          <w:tcPr>
-            <w:tcW w:w="1350" w:type="dxa"/>
-          </w:tcPr>
-          <w:p>
-            <w:r>
-              <w:t>String</w:t>
-            </w:r>
-          </w:p>
-        </w:tc>
-        <w:tc>
-          <w:tcPr>
-            <w:tcW w:w="6295" w:type="dxa"/>
-          </w:tcPr>
-          <w:p>
-            <w:r>
-              <w:t>Display the standings of the league</w:t>
-            </w:r>
-            <w:r>
-              <w:t xml:space="preserve"> &lt;- This is for the calculation, not a field.</w:t>
+              <w:t>The difference in score between the two teams</w:t>
             </w:r>
           </w:p>
         </w:tc>
@@ -756,7 +769,6 @@
         <w:pStyle w:val="Heading1"/>
       </w:pPr>
       <w:r>
-        <w:lastRenderedPageBreak/>
         <w:t>Calculation</w:t>
       </w:r>
     </w:p>
@@ -775,22 +787,56 @@
             <w:tcW w:w="9350" w:type="dxa"/>
           </w:tcPr>
           <w:p>
-            <w:r>
-              <w:t xml:space="preserve">Calculations needed to be done </w:t>
+            <w:pPr>
+              <w:spacing w:before="120" w:after="120"/>
+            </w:pPr>
+            <w:r>
+              <w:t>Calculate the Win Percentage for each team = Number of Wins / (Number of Wins + Number of Losses)</w:t>
+            </w:r>
+          </w:p>
+          <w:p>
+            <w:pPr>
+              <w:spacing w:before="120" w:after="120"/>
+            </w:pPr>
+            <w:r>
+              <w:t>Calculate the Number of Games for each team = Number of Wins + Number of Losses</w:t>
+            </w:r>
+          </w:p>
+          <w:p>
+            <w:pPr>
+              <w:spacing w:before="120" w:after="120"/>
+            </w:pPr>
+            <w:r>
+              <w:t xml:space="preserve">Calculate the Score Differential for each game = Team 1 </w:t>
             </w:r>
             <w:proofErr w:type="gramStart"/>
             <w:r>
-              <w:t>is</w:t>
+              <w:t>Score</w:t>
             </w:r>
             <w:proofErr w:type="gramEnd"/>
             <w:r>
-              <w:t xml:space="preserve"> Win percentage, Plus/Minus, number of wins and losses, and number of games won by mercy rule.</w:t>
+              <w:t xml:space="preserve"> - Team 2 </w:t>
+            </w:r>
+            <w:proofErr w:type="gramStart"/>
+            <w:r>
+              <w:t>Score</w:t>
+            </w:r>
+            <w:proofErr w:type="gramEnd"/>
+            <w:r>
+              <w:t xml:space="preserve"> (and vice versa)</w:t>
+            </w:r>
+          </w:p>
+          <w:p>
+            <w:pPr>
+              <w:spacing w:before="120" w:after="120"/>
+            </w:pPr>
+            <w:r>
+              <w:t>Count the total number of wins, losses, and mercy wins for each team.</w:t>
             </w:r>
           </w:p>
         </w:tc>
       </w:tr>
     </w:tbl>
-    <w:p/>
     <w:p>
       <w:pPr>
         <w:pStyle w:val="Heading1"/>
@@ -809,15 +855,7 @@
       </w:r>
       <w:proofErr w:type="gramEnd"/>
       <w:r>
-        <w:t xml:space="preserve"> a repository that you create.  The developer creates the repository for the topic that they will be coding.  Add the other two project group members to the </w:t>
-      </w:r>
-      <w:proofErr w:type="gramStart"/>
-      <w:r>
-        <w:t>repository(</w:t>
-      </w:r>
-      <w:proofErr w:type="gramEnd"/>
-      <w:r>
-        <w:t xml:space="preserve">or make public).  Add this document to the repository (Commit/Push).  </w:t>
+        <w:t xml:space="preserve"> a repository that you create.  The developer creates the repository for the topic that they will be coding.  Add the other two project group members to the repository(or make public).  Add this document to the repository (Commit/Push).  </w:t>
       </w:r>
       <w:r>
         <w:t>The description is to be added to the readme file of the repository.</w:t>
@@ -1780,6 +1818,63 @@
       </w:tblBorders>
     </w:tblPr>
   </w:style>
+  <w:style w:type="table" w:styleId="GridTable1Light">
+    <w:name w:val="Grid Table 1 Light"/>
+    <w:basedOn w:val="TableNormal"/>
+    <w:uiPriority w:val="46"/>
+    <w:rsid w:val="00815374"/>
+    <w:pPr>
+      <w:spacing w:after="0" w:line="240" w:lineRule="auto"/>
+    </w:pPr>
+    <w:tblPr>
+      <w:tblStyleRowBandSize w:val="1"/>
+      <w:tblStyleColBandSize w:val="1"/>
+      <w:tblBorders>
+        <w:top w:val="single" w:sz="4" w:space="0" w:color="999999" w:themeColor="text1" w:themeTint="66"/>
+        <w:left w:val="single" w:sz="4" w:space="0" w:color="999999" w:themeColor="text1" w:themeTint="66"/>
+        <w:bottom w:val="single" w:sz="4" w:space="0" w:color="999999" w:themeColor="text1" w:themeTint="66"/>
+        <w:right w:val="single" w:sz="4" w:space="0" w:color="999999" w:themeColor="text1" w:themeTint="66"/>
+        <w:insideH w:val="single" w:sz="4" w:space="0" w:color="999999" w:themeColor="text1" w:themeTint="66"/>
+        <w:insideV w:val="single" w:sz="4" w:space="0" w:color="999999" w:themeColor="text1" w:themeTint="66"/>
+      </w:tblBorders>
+    </w:tblPr>
+    <w:tblStylePr w:type="firstRow">
+      <w:rPr>
+        <w:b/>
+        <w:bCs/>
+      </w:rPr>
+      <w:tblPr/>
+      <w:tcPr>
+        <w:tcBorders>
+          <w:bottom w:val="single" w:sz="12" w:space="0" w:color="666666" w:themeColor="text1" w:themeTint="99"/>
+        </w:tcBorders>
+      </w:tcPr>
+    </w:tblStylePr>
+    <w:tblStylePr w:type="lastRow">
+      <w:rPr>
+        <w:b/>
+        <w:bCs/>
+      </w:rPr>
+      <w:tblPr/>
+      <w:tcPr>
+        <w:tcBorders>
+          <w:top w:val="double" w:sz="2" w:space="0" w:color="666666" w:themeColor="text1" w:themeTint="99"/>
+        </w:tcBorders>
+      </w:tcPr>
+    </w:tblStylePr>
+    <w:tblStylePr w:type="firstCol">
+      <w:rPr>
+        <w:b/>
+        <w:bCs/>
+      </w:rPr>
+    </w:tblStylePr>
+    <w:tblStylePr w:type="lastCol">
+      <w:rPr>
+        <w:b/>
+        <w:bCs/>
+      </w:rPr>
+    </w:tblStylePr>
+  </w:style>
 </w:styles>
 </file>
 

</xml_diff>